<commit_message>
Adiciona número da aula ao lado de cada atividade
- Atividades 1-2: Aula 14
- Atividades 3-4: Aula 15
- Atividades 5-8: Aula 16 e Aula Final

Todas 8 atividades agora com referência clara de quando devem ser realizadas

Co-Authored-By: Claude Haiku 4.5 <noreply@anthropic.com>
</commit_message>
<xml_diff>
--- a/sistema/FICHA-PRODUTO-MAIS-TECH/INTRODUCAO_COMUNICACAO_ORAL_ESCRITA/CEPLAS-VESPERTINO-2026-02/ATIVIDADES-CEPLAS-VESPERTINO-2026-02.docx
+++ b/sistema/FICHA-PRODUTO-MAIS-TECH/INTRODUCAO_COMUNICACAO_ORAL_ESCRITA/CEPLAS-VESPERTINO-2026-02/ATIVIDADES-CEPLAS-VESPERTINO-2026-02.docx
@@ -57,10 +57,10 @@
     <w:p/>
     <w:p>
       <w:pPr>
-        <w:pStyle w:val="Heading2"/>
+        <w:pStyle w:val="Heading3"/>
       </w:pPr>
       <w:r>
-        <w:t>✍️ ATIVIDADE 1 — Mapa Mental de Ferramentas</w:t>
+        <w:t>✍️ ATIVIDADE 1 — Mapa Mental de Ferramentas (Aula 14)</w:t>
       </w:r>
     </w:p>
     <w:p>
@@ -284,10 +284,10 @@
     <w:p/>
     <w:p>
       <w:pPr>
-        <w:pStyle w:val="Heading2"/>
+        <w:pStyle w:val="Heading3"/>
       </w:pPr>
       <w:r>
-        <w:t>✍️ ATIVIDADE 2 — Simulação de E-mail Profissional</w:t>
+        <w:t>✍️ ATIVIDADE 2 — Simulação de E-mail Profissional (Aula 14)</w:t>
       </w:r>
     </w:p>
     <w:p>
@@ -484,10 +484,10 @@
     <w:p/>
     <w:p>
       <w:pPr>
-        <w:pStyle w:val="Heading2"/>
+        <w:pStyle w:val="Heading3"/>
       </w:pPr>
       <w:r>
-        <w:t>✍️ ATIVIDADE 3 — Análise de E-mails Suspeitos</w:t>
+        <w:t>✍️ ATIVIDADE 3 — Análise de E-mails Suspeitos (Aula 15)</w:t>
       </w:r>
     </w:p>
     <w:p>
@@ -859,10 +859,10 @@
     <w:p/>
     <w:p>
       <w:pPr>
-        <w:pStyle w:val="Heading2"/>
+        <w:pStyle w:val="Heading3"/>
       </w:pPr>
       <w:r>
-        <w:t>✍️ ATIVIDADE 4 — Criador de Senhas Forte</w:t>
+        <w:t>✍️ ATIVIDADE 4 — Criador de Senhas Forte (Aula 15)</w:t>
       </w:r>
     </w:p>
     <w:p>
@@ -1122,10 +1122,10 @@
     <w:p/>
     <w:p>
       <w:pPr>
-        <w:pStyle w:val="Heading2"/>
+        <w:pStyle w:val="Heading3"/>
       </w:pPr>
       <w:r>
-        <w:t>✍️ ATIVIDADE 5 — Roteiro de Apresentação</w:t>
+        <w:t>✍️ ATIVIDADE 5 — Roteiro de Apresentação (Aula 16)</w:t>
       </w:r>
     </w:p>
     <w:p>
@@ -1415,10 +1415,10 @@
     <w:p/>
     <w:p>
       <w:pPr>
-        <w:pStyle w:val="Heading2"/>
+        <w:pStyle w:val="Heading3"/>
       </w:pPr>
       <w:r>
-        <w:t>✍️ ATIVIDADE 6 — Avaliação de Colegas</w:t>
+        <w:t>✍️ ATIVIDADE 6 — Avaliação de Colegas (Aula 16)</w:t>
       </w:r>
     </w:p>
     <w:p>
@@ -1666,10 +1666,10 @@
     <w:p/>
     <w:p>
       <w:pPr>
-        <w:pStyle w:val="Heading2"/>
+        <w:pStyle w:val="Heading3"/>
       </w:pPr>
       <w:r>
-        <w:t>✍️ ATIVIDADE 7 — Plano da Avaliação Final</w:t>
+        <w:t>✍️ ATIVIDADE 7 — Plano da Avaliação Final (Aula 16)</w:t>
       </w:r>
     </w:p>
     <w:p>
@@ -2030,10 +2030,10 @@
     <w:p/>
     <w:p>
       <w:pPr>
-        <w:pStyle w:val="Heading2"/>
+        <w:pStyle w:val="Heading3"/>
       </w:pPr>
       <w:r>
-        <w:t>✍️ ATIVIDADE 8 — Autorreflexão Final</w:t>
+        <w:t>✍️ ATIVIDADE 8 — Autorreflexão Final (Aula Final)</w:t>
       </w:r>
     </w:p>
     <w:p>

</xml_diff>